<commit_message>
Mise en commentaire de l'import de authGuard sur les pages qu'on souhaite analyser
</commit_message>
<xml_diff>
--- a/doc/Projet de Numérique Durable.docx
+++ b/doc/Projet de Numérique Durable.docx
@@ -69,6 +69,14 @@
     </w:p>
     <w:sdt>
       <w:sdtPr>
+        <w:rPr>
+          <w:rFonts w:asciiTheme="minorHAnsi" w:eastAsiaTheme="minorEastAsia" w:hAnsiTheme="minorHAnsi" w:cstheme="minorBidi"/>
+          <w:color w:val="auto"/>
+          <w:kern w:val="2"/>
+          <w:sz w:val="24"/>
+          <w:szCs w:val="24"/>
+          <w14:ligatures w14:val="standardContextual"/>
+        </w:rPr>
         <w:id w:val="-1931341630"/>
         <w:docPartObj>
           <w:docPartGallery w:val="Table of Contents"/>
@@ -77,14 +85,8 @@
       </w:sdtPr>
       <w:sdtEndPr>
         <w:rPr>
-          <w:rFonts w:asciiTheme="minorHAnsi" w:eastAsiaTheme="minorEastAsia" w:hAnsiTheme="minorHAnsi" w:cstheme="minorBidi"/>
           <w:b/>
           <w:bCs/>
-          <w:color w:val="auto"/>
-          <w:kern w:val="2"/>
-          <w:sz w:val="24"/>
-          <w:szCs w:val="24"/>
-          <w14:ligatures w14:val="standardContextual"/>
         </w:rPr>
       </w:sdtEndPr>
       <w:sdtContent>
@@ -105,6 +107,15 @@
           </w:r>
         </w:p>
         <w:p>
+          <w:pPr>
+            <w:pStyle w:val="TM1"/>
+            <w:tabs>
+              <w:tab w:val="right" w:leader="dot" w:pos="9062"/>
+            </w:tabs>
+            <w:rPr>
+              <w:noProof/>
+            </w:rPr>
+          </w:pPr>
           <w:r>
             <w:fldChar w:fldCharType="begin"/>
           </w:r>
@@ -114,14 +125,677 @@
           <w:r>
             <w:fldChar w:fldCharType="separate"/>
           </w:r>
-          <w:r>
+          <w:hyperlink w:anchor="_Toc228640155" w:history="1">
+            <w:r>
+              <w:rPr>
+                <w:rStyle w:val="Lienhypertexte"/>
+                <w:noProof/>
+              </w:rPr>
+              <w:t>Présentation du projet</w:t>
+            </w:r>
+            <w:r>
+              <w:rPr>
+                <w:noProof/>
+                <w:webHidden/>
+              </w:rPr>
+              <w:tab/>
+            </w:r>
+            <w:r>
+              <w:rPr>
+                <w:noProof/>
+                <w:webHidden/>
+              </w:rPr>
+              <w:fldChar w:fldCharType="begin"/>
+            </w:r>
+            <w:r>
+              <w:rPr>
+                <w:noProof/>
+                <w:webHidden/>
+              </w:rPr>
+              <w:instrText xml:space="preserve"> PAGEREF _Toc228640155 \h </w:instrText>
+            </w:r>
+            <w:r>
+              <w:rPr>
+                <w:noProof/>
+                <w:webHidden/>
+              </w:rPr>
+            </w:r>
+            <w:r>
+              <w:rPr>
+                <w:noProof/>
+                <w:webHidden/>
+              </w:rPr>
+              <w:fldChar w:fldCharType="separate"/>
+            </w:r>
+            <w:r>
+              <w:rPr>
+                <w:noProof/>
+                <w:webHidden/>
+              </w:rPr>
+              <w:t>3</w:t>
+            </w:r>
+            <w:r>
+              <w:rPr>
+                <w:noProof/>
+                <w:webHidden/>
+              </w:rPr>
+              <w:fldChar w:fldCharType="end"/>
+            </w:r>
+          </w:hyperlink>
+        </w:p>
+        <w:p>
+          <w:pPr>
+            <w:pStyle w:val="TM2"/>
+            <w:tabs>
+              <w:tab w:val="right" w:leader="dot" w:pos="9062"/>
+            </w:tabs>
             <w:rPr>
-              <w:b/>
-              <w:bCs/>
               <w:noProof/>
             </w:rPr>
-            <w:t>Aucune entrée de table des matières n'a été trouvée.</w:t>
-          </w:r>
+          </w:pPr>
+          <w:hyperlink w:anchor="_Toc228640156" w:history="1">
+            <w:r>
+              <w:rPr>
+                <w:rStyle w:val="Lienhypertexte"/>
+                <w:noProof/>
+              </w:rPr>
+              <w:t>Proposition de valeur</w:t>
+            </w:r>
+            <w:r>
+              <w:rPr>
+                <w:noProof/>
+                <w:webHidden/>
+              </w:rPr>
+              <w:tab/>
+            </w:r>
+            <w:r>
+              <w:rPr>
+                <w:noProof/>
+                <w:webHidden/>
+              </w:rPr>
+              <w:fldChar w:fldCharType="begin"/>
+            </w:r>
+            <w:r>
+              <w:rPr>
+                <w:noProof/>
+                <w:webHidden/>
+              </w:rPr>
+              <w:instrText xml:space="preserve"> PAGEREF _Toc228640156 \h </w:instrText>
+            </w:r>
+            <w:r>
+              <w:rPr>
+                <w:noProof/>
+                <w:webHidden/>
+              </w:rPr>
+            </w:r>
+            <w:r>
+              <w:rPr>
+                <w:noProof/>
+                <w:webHidden/>
+              </w:rPr>
+              <w:fldChar w:fldCharType="separate"/>
+            </w:r>
+            <w:r>
+              <w:rPr>
+                <w:noProof/>
+                <w:webHidden/>
+              </w:rPr>
+              <w:t>3</w:t>
+            </w:r>
+            <w:r>
+              <w:rPr>
+                <w:noProof/>
+                <w:webHidden/>
+              </w:rPr>
+              <w:fldChar w:fldCharType="end"/>
+            </w:r>
+          </w:hyperlink>
+        </w:p>
+        <w:p>
+          <w:pPr>
+            <w:pStyle w:val="TM2"/>
+            <w:tabs>
+              <w:tab w:val="right" w:leader="dot" w:pos="9062"/>
+            </w:tabs>
+            <w:rPr>
+              <w:noProof/>
+            </w:rPr>
+          </w:pPr>
+          <w:hyperlink w:anchor="_Toc228640157" w:history="1">
+            <w:r>
+              <w:rPr>
+                <w:rStyle w:val="Lienhypertexte"/>
+                <w:noProof/>
+              </w:rPr>
+              <w:t>MVP</w:t>
+            </w:r>
+            <w:r>
+              <w:rPr>
+                <w:noProof/>
+                <w:webHidden/>
+              </w:rPr>
+              <w:tab/>
+            </w:r>
+            <w:r>
+              <w:rPr>
+                <w:noProof/>
+                <w:webHidden/>
+              </w:rPr>
+              <w:fldChar w:fldCharType="begin"/>
+            </w:r>
+            <w:r>
+              <w:rPr>
+                <w:noProof/>
+                <w:webHidden/>
+              </w:rPr>
+              <w:instrText xml:space="preserve"> PAGEREF _Toc228640157 \h </w:instrText>
+            </w:r>
+            <w:r>
+              <w:rPr>
+                <w:noProof/>
+                <w:webHidden/>
+              </w:rPr>
+            </w:r>
+            <w:r>
+              <w:rPr>
+                <w:noProof/>
+                <w:webHidden/>
+              </w:rPr>
+              <w:fldChar w:fldCharType="separate"/>
+            </w:r>
+            <w:r>
+              <w:rPr>
+                <w:noProof/>
+                <w:webHidden/>
+              </w:rPr>
+              <w:t>3</w:t>
+            </w:r>
+            <w:r>
+              <w:rPr>
+                <w:noProof/>
+                <w:webHidden/>
+              </w:rPr>
+              <w:fldChar w:fldCharType="end"/>
+            </w:r>
+          </w:hyperlink>
+        </w:p>
+        <w:p>
+          <w:pPr>
+            <w:pStyle w:val="TM2"/>
+            <w:tabs>
+              <w:tab w:val="right" w:leader="dot" w:pos="9062"/>
+            </w:tabs>
+            <w:rPr>
+              <w:noProof/>
+            </w:rPr>
+          </w:pPr>
+          <w:hyperlink w:anchor="_Toc228640158" w:history="1">
+            <w:r>
+              <w:rPr>
+                <w:rStyle w:val="Lienhypertexte"/>
+                <w:noProof/>
+              </w:rPr>
+              <w:t>Utilisateurs et leurs rôles</w:t>
+            </w:r>
+            <w:r>
+              <w:rPr>
+                <w:noProof/>
+                <w:webHidden/>
+              </w:rPr>
+              <w:tab/>
+            </w:r>
+            <w:r>
+              <w:rPr>
+                <w:noProof/>
+                <w:webHidden/>
+              </w:rPr>
+              <w:fldChar w:fldCharType="begin"/>
+            </w:r>
+            <w:r>
+              <w:rPr>
+                <w:noProof/>
+                <w:webHidden/>
+              </w:rPr>
+              <w:instrText xml:space="preserve"> PAGEREF _Toc228640158 \h </w:instrText>
+            </w:r>
+            <w:r>
+              <w:rPr>
+                <w:noProof/>
+                <w:webHidden/>
+              </w:rPr>
+            </w:r>
+            <w:r>
+              <w:rPr>
+                <w:noProof/>
+                <w:webHidden/>
+              </w:rPr>
+              <w:fldChar w:fldCharType="separate"/>
+            </w:r>
+            <w:r>
+              <w:rPr>
+                <w:noProof/>
+                <w:webHidden/>
+              </w:rPr>
+              <w:t>3</w:t>
+            </w:r>
+            <w:r>
+              <w:rPr>
+                <w:noProof/>
+                <w:webHidden/>
+              </w:rPr>
+              <w:fldChar w:fldCharType="end"/>
+            </w:r>
+          </w:hyperlink>
+        </w:p>
+        <w:p>
+          <w:pPr>
+            <w:pStyle w:val="TM1"/>
+            <w:tabs>
+              <w:tab w:val="right" w:leader="dot" w:pos="9062"/>
+            </w:tabs>
+            <w:rPr>
+              <w:noProof/>
+            </w:rPr>
+          </w:pPr>
+          <w:hyperlink w:anchor="_Toc228640159" w:history="1">
+            <w:r>
+              <w:rPr>
+                <w:rStyle w:val="Lienhypertexte"/>
+                <w:noProof/>
+              </w:rPr>
+              <w:t>Architecture et conception</w:t>
+            </w:r>
+            <w:r>
+              <w:rPr>
+                <w:noProof/>
+                <w:webHidden/>
+              </w:rPr>
+              <w:tab/>
+            </w:r>
+            <w:r>
+              <w:rPr>
+                <w:noProof/>
+                <w:webHidden/>
+              </w:rPr>
+              <w:fldChar w:fldCharType="begin"/>
+            </w:r>
+            <w:r>
+              <w:rPr>
+                <w:noProof/>
+                <w:webHidden/>
+              </w:rPr>
+              <w:instrText xml:space="preserve"> PAGEREF _Toc228640159 \h </w:instrText>
+            </w:r>
+            <w:r>
+              <w:rPr>
+                <w:noProof/>
+                <w:webHidden/>
+              </w:rPr>
+            </w:r>
+            <w:r>
+              <w:rPr>
+                <w:noProof/>
+                <w:webHidden/>
+              </w:rPr>
+              <w:fldChar w:fldCharType="separate"/>
+            </w:r>
+            <w:r>
+              <w:rPr>
+                <w:noProof/>
+                <w:webHidden/>
+              </w:rPr>
+              <w:t>5</w:t>
+            </w:r>
+            <w:r>
+              <w:rPr>
+                <w:noProof/>
+                <w:webHidden/>
+              </w:rPr>
+              <w:fldChar w:fldCharType="end"/>
+            </w:r>
+          </w:hyperlink>
+        </w:p>
+        <w:p>
+          <w:pPr>
+            <w:pStyle w:val="TM2"/>
+            <w:tabs>
+              <w:tab w:val="right" w:leader="dot" w:pos="9062"/>
+            </w:tabs>
+            <w:rPr>
+              <w:noProof/>
+            </w:rPr>
+          </w:pPr>
+          <w:hyperlink w:anchor="_Toc228640160" w:history="1">
+            <w:r>
+              <w:rPr>
+                <w:rStyle w:val="Lienhypertexte"/>
+                <w:noProof/>
+              </w:rPr>
+              <w:t>Cas d’utilisation :</w:t>
+            </w:r>
+            <w:r>
+              <w:rPr>
+                <w:noProof/>
+                <w:webHidden/>
+              </w:rPr>
+              <w:tab/>
+            </w:r>
+            <w:r>
+              <w:rPr>
+                <w:noProof/>
+                <w:webHidden/>
+              </w:rPr>
+              <w:fldChar w:fldCharType="begin"/>
+            </w:r>
+            <w:r>
+              <w:rPr>
+                <w:noProof/>
+                <w:webHidden/>
+              </w:rPr>
+              <w:instrText xml:space="preserve"> PAGEREF _Toc228640160 \h </w:instrText>
+            </w:r>
+            <w:r>
+              <w:rPr>
+                <w:noProof/>
+                <w:webHidden/>
+              </w:rPr>
+            </w:r>
+            <w:r>
+              <w:rPr>
+                <w:noProof/>
+                <w:webHidden/>
+              </w:rPr>
+              <w:fldChar w:fldCharType="separate"/>
+            </w:r>
+            <w:r>
+              <w:rPr>
+                <w:noProof/>
+                <w:webHidden/>
+              </w:rPr>
+              <w:t>5</w:t>
+            </w:r>
+            <w:r>
+              <w:rPr>
+                <w:noProof/>
+                <w:webHidden/>
+              </w:rPr>
+              <w:fldChar w:fldCharType="end"/>
+            </w:r>
+          </w:hyperlink>
+        </w:p>
+        <w:p>
+          <w:pPr>
+            <w:pStyle w:val="TM2"/>
+            <w:tabs>
+              <w:tab w:val="right" w:leader="dot" w:pos="9062"/>
+            </w:tabs>
+            <w:rPr>
+              <w:noProof/>
+            </w:rPr>
+          </w:pPr>
+          <w:hyperlink w:anchor="_Toc228640161" w:history="1">
+            <w:r>
+              <w:rPr>
+                <w:rStyle w:val="Lienhypertexte"/>
+                <w:noProof/>
+              </w:rPr>
+              <w:t>Diagramme de classe</w:t>
+            </w:r>
+            <w:r>
+              <w:rPr>
+                <w:noProof/>
+                <w:webHidden/>
+              </w:rPr>
+              <w:tab/>
+            </w:r>
+            <w:r>
+              <w:rPr>
+                <w:noProof/>
+                <w:webHidden/>
+              </w:rPr>
+              <w:fldChar w:fldCharType="begin"/>
+            </w:r>
+            <w:r>
+              <w:rPr>
+                <w:noProof/>
+                <w:webHidden/>
+              </w:rPr>
+              <w:instrText xml:space="preserve"> PAGEREF _Toc228640161 \h </w:instrText>
+            </w:r>
+            <w:r>
+              <w:rPr>
+                <w:noProof/>
+                <w:webHidden/>
+              </w:rPr>
+            </w:r>
+            <w:r>
+              <w:rPr>
+                <w:noProof/>
+                <w:webHidden/>
+              </w:rPr>
+              <w:fldChar w:fldCharType="separate"/>
+            </w:r>
+            <w:r>
+              <w:rPr>
+                <w:noProof/>
+                <w:webHidden/>
+              </w:rPr>
+              <w:t>6</w:t>
+            </w:r>
+            <w:r>
+              <w:rPr>
+                <w:noProof/>
+                <w:webHidden/>
+              </w:rPr>
+              <w:fldChar w:fldCharType="end"/>
+            </w:r>
+          </w:hyperlink>
+        </w:p>
+        <w:p>
+          <w:pPr>
+            <w:pStyle w:val="TM2"/>
+            <w:tabs>
+              <w:tab w:val="right" w:leader="dot" w:pos="9062"/>
+            </w:tabs>
+            <w:rPr>
+              <w:noProof/>
+            </w:rPr>
+          </w:pPr>
+          <w:hyperlink w:anchor="_Toc228640162" w:history="1">
+            <w:r>
+              <w:rPr>
+                <w:rStyle w:val="Lienhypertexte"/>
+                <w:noProof/>
+              </w:rPr>
+              <w:t>Diagramme de séquence</w:t>
+            </w:r>
+            <w:r>
+              <w:rPr>
+                <w:noProof/>
+                <w:webHidden/>
+              </w:rPr>
+              <w:tab/>
+            </w:r>
+            <w:r>
+              <w:rPr>
+                <w:noProof/>
+                <w:webHidden/>
+              </w:rPr>
+              <w:fldChar w:fldCharType="begin"/>
+            </w:r>
+            <w:r>
+              <w:rPr>
+                <w:noProof/>
+                <w:webHidden/>
+              </w:rPr>
+              <w:instrText xml:space="preserve"> PAGEREF _Toc228640162 \h </w:instrText>
+            </w:r>
+            <w:r>
+              <w:rPr>
+                <w:noProof/>
+                <w:webHidden/>
+              </w:rPr>
+            </w:r>
+            <w:r>
+              <w:rPr>
+                <w:noProof/>
+                <w:webHidden/>
+              </w:rPr>
+              <w:fldChar w:fldCharType="separate"/>
+            </w:r>
+            <w:r>
+              <w:rPr>
+                <w:noProof/>
+                <w:webHidden/>
+              </w:rPr>
+              <w:t>6</w:t>
+            </w:r>
+            <w:r>
+              <w:rPr>
+                <w:noProof/>
+                <w:webHidden/>
+              </w:rPr>
+              <w:fldChar w:fldCharType="end"/>
+            </w:r>
+          </w:hyperlink>
+        </w:p>
+        <w:p>
+          <w:pPr>
+            <w:pStyle w:val="TM1"/>
+            <w:tabs>
+              <w:tab w:val="right" w:leader="dot" w:pos="9062"/>
+            </w:tabs>
+            <w:rPr>
+              <w:noProof/>
+            </w:rPr>
+          </w:pPr>
+          <w:hyperlink w:anchor="_Toc228640163" w:history="1">
+            <w:r>
+              <w:rPr>
+                <w:rStyle w:val="Lienhypertexte"/>
+                <w:noProof/>
+              </w:rPr>
+              <w:t>Choix technologiques</w:t>
+            </w:r>
+            <w:r>
+              <w:rPr>
+                <w:noProof/>
+                <w:webHidden/>
+              </w:rPr>
+              <w:tab/>
+            </w:r>
+            <w:r>
+              <w:rPr>
+                <w:noProof/>
+                <w:webHidden/>
+              </w:rPr>
+              <w:fldChar w:fldCharType="begin"/>
+            </w:r>
+            <w:r>
+              <w:rPr>
+                <w:noProof/>
+                <w:webHidden/>
+              </w:rPr>
+              <w:instrText xml:space="preserve"> PAGEREF _Toc228640163 \h </w:instrText>
+            </w:r>
+            <w:r>
+              <w:rPr>
+                <w:noProof/>
+                <w:webHidden/>
+              </w:rPr>
+            </w:r>
+            <w:r>
+              <w:rPr>
+                <w:noProof/>
+                <w:webHidden/>
+              </w:rPr>
+              <w:fldChar w:fldCharType="separate"/>
+            </w:r>
+            <w:r>
+              <w:rPr>
+                <w:noProof/>
+                <w:webHidden/>
+              </w:rPr>
+              <w:t>7</w:t>
+            </w:r>
+            <w:r>
+              <w:rPr>
+                <w:noProof/>
+                <w:webHidden/>
+              </w:rPr>
+              <w:fldChar w:fldCharType="end"/>
+            </w:r>
+          </w:hyperlink>
+        </w:p>
+        <w:p>
+          <w:pPr>
+            <w:pStyle w:val="TM1"/>
+            <w:tabs>
+              <w:tab w:val="right" w:leader="dot" w:pos="9062"/>
+            </w:tabs>
+            <w:rPr>
+              <w:noProof/>
+            </w:rPr>
+          </w:pPr>
+          <w:hyperlink w:anchor="_Toc228640164" w:history="1">
+            <w:r>
+              <w:rPr>
+                <w:rStyle w:val="Lienhypertexte"/>
+                <w:noProof/>
+              </w:rPr>
+              <w:t>Implémentation</w:t>
+            </w:r>
+            <w:r>
+              <w:rPr>
+                <w:noProof/>
+                <w:webHidden/>
+              </w:rPr>
+              <w:tab/>
+            </w:r>
+            <w:r>
+              <w:rPr>
+                <w:noProof/>
+                <w:webHidden/>
+              </w:rPr>
+              <w:fldChar w:fldCharType="begin"/>
+            </w:r>
+            <w:r>
+              <w:rPr>
+                <w:noProof/>
+                <w:webHidden/>
+              </w:rPr>
+              <w:instrText xml:space="preserve"> PAGEREF _Toc228640164 \h </w:instrText>
+            </w:r>
+            <w:r>
+              <w:rPr>
+                <w:noProof/>
+                <w:webHidden/>
+              </w:rPr>
+            </w:r>
+            <w:r>
+              <w:rPr>
+                <w:noProof/>
+                <w:webHidden/>
+              </w:rPr>
+              <w:fldChar w:fldCharType="separate"/>
+            </w:r>
+            <w:r>
+              <w:rPr>
+                <w:noProof/>
+                <w:webHidden/>
+              </w:rPr>
+              <w:t>7</w:t>
+            </w:r>
+            <w:r>
+              <w:rPr>
+                <w:noProof/>
+                <w:webHidden/>
+              </w:rPr>
+              <w:fldChar w:fldCharType="end"/>
+            </w:r>
+          </w:hyperlink>
+        </w:p>
+        <w:p>
           <w:r>
             <w:rPr>
               <w:b/>
@@ -141,9 +815,14 @@
       <w:pPr>
         <w:pStyle w:val="Titre1"/>
       </w:pPr>
+      <w:bookmarkStart w:id="0" w:name="_Toc228640155"/>
       <w:r>
         <w:lastRenderedPageBreak/>
-        <w:t xml:space="preserve">Présentation du projet </w:t>
+        <w:t>Présentation du projet</w:t>
+      </w:r>
+      <w:bookmarkEnd w:id="0"/>
+      <w:r>
+        <w:t xml:space="preserve"> </w:t>
       </w:r>
     </w:p>
     <w:p/>
@@ -151,9 +830,11 @@
       <w:pPr>
         <w:pStyle w:val="Titre2"/>
       </w:pPr>
+      <w:bookmarkStart w:id="1" w:name="_Toc228640156"/>
       <w:r>
         <w:t>Proposition de valeur</w:t>
       </w:r>
+      <w:bookmarkEnd w:id="1"/>
     </w:p>
     <w:p>
       <w:r>
@@ -165,9 +846,11 @@
       <w:pPr>
         <w:pStyle w:val="Titre2"/>
       </w:pPr>
+      <w:bookmarkStart w:id="2" w:name="_Toc228640157"/>
       <w:r>
         <w:t>MVP</w:t>
       </w:r>
+      <w:bookmarkEnd w:id="2"/>
     </w:p>
     <w:p>
       <w:r>
@@ -272,8 +955,13 @@
           <w:rFonts w:ascii="Times New Roman" w:hAnsi="Times New Roman"/>
         </w:rPr>
       </w:pPr>
-      <w:r>
-        <w:t>Utilisateurs et leurs rôles </w:t>
+      <w:bookmarkStart w:id="3" w:name="_Toc228640158"/>
+      <w:r>
+        <w:t>Utilisateurs et leurs rôles</w:t>
+      </w:r>
+      <w:bookmarkEnd w:id="3"/>
+      <w:r>
+        <w:t> </w:t>
       </w:r>
     </w:p>
     <w:p>
@@ -2247,18 +2935,22 @@
       <w:pPr>
         <w:pStyle w:val="Titre1"/>
       </w:pPr>
+      <w:bookmarkStart w:id="4" w:name="_Toc228640159"/>
       <w:r>
         <w:lastRenderedPageBreak/>
         <w:t>Architecture et conception</w:t>
       </w:r>
+      <w:bookmarkEnd w:id="4"/>
     </w:p>
     <w:p>
       <w:pPr>
         <w:pStyle w:val="Titre2"/>
       </w:pPr>
+      <w:bookmarkStart w:id="5" w:name="_Toc228640160"/>
       <w:r>
         <w:t>Cas d’utilisation :</w:t>
       </w:r>
+      <w:bookmarkEnd w:id="5"/>
     </w:p>
     <w:p>
       <w:pPr>
@@ -2266,6 +2958,9 @@
         <w:jc w:val="center"/>
       </w:pPr>
       <w:r>
+        <w:rPr>
+          <w:noProof/>
+        </w:rPr>
         <w:drawing>
           <wp:inline distT="0" distB="0" distL="0" distR="0" wp14:anchorId="0CB81BE9" wp14:editId="1538BD5B">
             <wp:extent cx="5760720" cy="6702425"/>
@@ -2319,10 +3014,12 @@
       <w:pPr>
         <w:pStyle w:val="Titre2"/>
       </w:pPr>
+      <w:bookmarkStart w:id="6" w:name="_Toc228640161"/>
       <w:r>
         <w:lastRenderedPageBreak/>
         <w:t>Diagramme de classe</w:t>
       </w:r>
+      <w:bookmarkEnd w:id="6"/>
     </w:p>
     <w:p>
       <w:pPr>
@@ -2330,6 +3027,9 @@
         <w:jc w:val="center"/>
       </w:pPr>
       <w:r>
+        <w:rPr>
+          <w:noProof/>
+        </w:rPr>
         <w:drawing>
           <wp:inline distT="0" distB="0" distL="0" distR="0" wp14:anchorId="4B1C5350" wp14:editId="18B4F3B7">
             <wp:extent cx="2000529" cy="3086531"/>
@@ -2381,8 +3081,13 @@
       <w:pPr>
         <w:pStyle w:val="Titre2"/>
       </w:pPr>
-      <w:r>
-        <w:t>Diagramme de séquence </w:t>
+      <w:bookmarkStart w:id="7" w:name="_Toc228640162"/>
+      <w:r>
+        <w:t>Diagramme de séquence</w:t>
+      </w:r>
+      <w:bookmarkEnd w:id="7"/>
+      <w:r>
+        <w:t> </w:t>
       </w:r>
     </w:p>
     <w:p>
@@ -2391,6 +3096,9 @@
         <w:jc w:val="center"/>
       </w:pPr>
       <w:r>
+        <w:rPr>
+          <w:noProof/>
+        </w:rPr>
         <w:drawing>
           <wp:inline distT="0" distB="0" distL="0" distR="0" wp14:anchorId="2A865128" wp14:editId="7DE445D1">
             <wp:extent cx="5687219" cy="3639058"/>
@@ -2442,10 +3150,12 @@
       <w:pPr>
         <w:pStyle w:val="Titre1"/>
       </w:pPr>
+      <w:bookmarkStart w:id="8" w:name="_Toc228640163"/>
       <w:r>
         <w:lastRenderedPageBreak/>
         <w:t>Choix technologiques</w:t>
       </w:r>
+      <w:bookmarkEnd w:id="8"/>
     </w:p>
     <w:p/>
     <w:tbl>
@@ -2609,10 +3319,860 @@
       <w:pPr>
         <w:pStyle w:val="Titre1"/>
       </w:pPr>
+      <w:bookmarkStart w:id="9" w:name="_Toc228640164"/>
       <w:r>
         <w:t>Implémentation</w:t>
       </w:r>
+      <w:bookmarkEnd w:id="9"/>
     </w:p>
+    <w:p/>
+    <w:p>
+      <w:pPr>
+        <w:pStyle w:val="Titre1"/>
+      </w:pPr>
+      <w:r>
+        <w:t>Analyse de l’empreinte carbone</w:t>
+      </w:r>
+    </w:p>
+    <w:p>
+      <w:r>
+        <w:t xml:space="preserve">En utilisant </w:t>
+      </w:r>
+      <w:r>
+        <w:t>les extensions GreenIT et</w:t>
+      </w:r>
+      <w:r>
+        <w:t xml:space="preserve"> Lighthouse sur chrome, nous avons pu </w:t>
+      </w:r>
+      <w:r>
+        <w:t>analyser</w:t>
+      </w:r>
+      <w:r>
+        <w:t xml:space="preserve"> les pages principales de notre site web : login.html, </w:t>
+      </w:r>
+      <w:r>
+        <w:t xml:space="preserve">singup.html, </w:t>
+      </w:r>
+      <w:r>
+        <w:t>fiches.html, fiche_display.html et admin.html</w:t>
+      </w:r>
+      <w:r>
+        <w:t>.</w:t>
+      </w:r>
+    </w:p>
+    <w:p>
+      <w:r>
+        <w:t xml:space="preserve">Nous avons pu </w:t>
+      </w:r>
+      <w:r>
+        <w:t>relever</w:t>
+      </w:r>
+      <w:r>
+        <w:t xml:space="preserve"> les résultats suivants :</w:t>
+      </w:r>
+    </w:p>
+    <w:tbl>
+      <w:tblPr>
+        <w:tblStyle w:val="Grilledutableau"/>
+        <w:tblW w:w="9498" w:type="dxa"/>
+        <w:tblInd w:w="-147" w:type="dxa"/>
+        <w:tblLayout w:type="fixed"/>
+        <w:tblLook w:val="04A0" w:firstRow="1" w:lastRow="0" w:firstColumn="1" w:lastColumn="0" w:noHBand="0" w:noVBand="1"/>
+      </w:tblPr>
+      <w:tblGrid>
+        <w:gridCol w:w="1705"/>
+        <w:gridCol w:w="1559"/>
+        <w:gridCol w:w="1558"/>
+        <w:gridCol w:w="1559"/>
+        <w:gridCol w:w="1558"/>
+        <w:gridCol w:w="1559"/>
+      </w:tblGrid>
+      <w:tr>
+        <w:trPr>
+          <w:trHeight w:val="586"/>
+        </w:trPr>
+        <w:tc>
+          <w:tcPr>
+            <w:tcW w:w="1705" w:type="dxa"/>
+            <w:shd w:val="clear" w:color="auto" w:fill="E8E8E8" w:themeFill="background2"/>
+          </w:tcPr>
+          <w:p>
+            <w:pPr>
+              <w:rPr>
+                <w:b/>
+                <w:bCs/>
+              </w:rPr>
+            </w:pPr>
+            <w:r>
+              <w:rPr>
+                <w:b/>
+                <w:bCs/>
+              </w:rPr>
+              <w:t xml:space="preserve">Pages </w:t>
+            </w:r>
+          </w:p>
+        </w:tc>
+        <w:tc>
+          <w:tcPr>
+            <w:tcW w:w="1559" w:type="dxa"/>
+            <w:shd w:val="clear" w:color="auto" w:fill="E8E8E8" w:themeFill="background2"/>
+          </w:tcPr>
+          <w:p>
+            <w:pPr>
+              <w:rPr>
+                <w:b/>
+                <w:bCs/>
+              </w:rPr>
+            </w:pPr>
+            <w:r>
+              <w:rPr>
+                <w:b/>
+                <w:bCs/>
+              </w:rPr>
+              <w:t>Login.html</w:t>
+            </w:r>
+          </w:p>
+        </w:tc>
+        <w:tc>
+          <w:tcPr>
+            <w:tcW w:w="1558" w:type="dxa"/>
+            <w:shd w:val="clear" w:color="auto" w:fill="E8E8E8" w:themeFill="background2"/>
+          </w:tcPr>
+          <w:p>
+            <w:pPr>
+              <w:rPr>
+                <w:b/>
+                <w:bCs/>
+              </w:rPr>
+            </w:pPr>
+            <w:r>
+              <w:rPr>
+                <w:b/>
+                <w:bCs/>
+              </w:rPr>
+              <w:t>Singup.html</w:t>
+            </w:r>
+          </w:p>
+        </w:tc>
+        <w:tc>
+          <w:tcPr>
+            <w:tcW w:w="1559" w:type="dxa"/>
+            <w:shd w:val="clear" w:color="auto" w:fill="E8E8E8" w:themeFill="background2"/>
+          </w:tcPr>
+          <w:p>
+            <w:pPr>
+              <w:rPr>
+                <w:b/>
+                <w:bCs/>
+              </w:rPr>
+            </w:pPr>
+            <w:r>
+              <w:rPr>
+                <w:b/>
+                <w:bCs/>
+              </w:rPr>
+              <w:t>Fiches.html</w:t>
+            </w:r>
+          </w:p>
+        </w:tc>
+        <w:tc>
+          <w:tcPr>
+            <w:tcW w:w="1558" w:type="dxa"/>
+            <w:shd w:val="clear" w:color="auto" w:fill="E8E8E8" w:themeFill="background2"/>
+          </w:tcPr>
+          <w:p>
+            <w:pPr>
+              <w:rPr>
+                <w:b/>
+                <w:bCs/>
+              </w:rPr>
+            </w:pPr>
+            <w:r>
+              <w:rPr>
+                <w:b/>
+                <w:bCs/>
+              </w:rPr>
+              <w:t>Fiche_display.html</w:t>
+            </w:r>
+          </w:p>
+        </w:tc>
+        <w:tc>
+          <w:tcPr>
+            <w:tcW w:w="1559" w:type="dxa"/>
+            <w:shd w:val="clear" w:color="auto" w:fill="E8E8E8" w:themeFill="background2"/>
+          </w:tcPr>
+          <w:p>
+            <w:pPr>
+              <w:rPr>
+                <w:b/>
+                <w:bCs/>
+              </w:rPr>
+            </w:pPr>
+            <w:r>
+              <w:rPr>
+                <w:b/>
+                <w:bCs/>
+              </w:rPr>
+              <w:t>Admin.html</w:t>
+            </w:r>
+          </w:p>
+        </w:tc>
+      </w:tr>
+      <w:tr>
+        <w:trPr>
+          <w:trHeight w:val="586"/>
+        </w:trPr>
+        <w:tc>
+          <w:tcPr>
+            <w:tcW w:w="1705" w:type="dxa"/>
+          </w:tcPr>
+          <w:p>
+            <w:pPr>
+              <w:rPr>
+                <w:b/>
+                <w:bCs/>
+              </w:rPr>
+            </w:pPr>
+            <w:r>
+              <w:rPr>
+                <w:b/>
+                <w:bCs/>
+              </w:rPr>
+              <w:t>Poid total de la page (Ko)</w:t>
+            </w:r>
+          </w:p>
+        </w:tc>
+        <w:tc>
+          <w:tcPr>
+            <w:tcW w:w="1559" w:type="dxa"/>
+          </w:tcPr>
+          <w:p>
+            <w:r>
+              <w:t>1 ko</w:t>
+            </w:r>
+          </w:p>
+        </w:tc>
+        <w:tc>
+          <w:tcPr>
+            <w:tcW w:w="1558" w:type="dxa"/>
+          </w:tcPr>
+          <w:p>
+            <w:r>
+              <w:t>1 ko</w:t>
+            </w:r>
+          </w:p>
+        </w:tc>
+        <w:tc>
+          <w:tcPr>
+            <w:tcW w:w="1559" w:type="dxa"/>
+          </w:tcPr>
+          <w:p>
+            <w:r>
+              <w:t>3</w:t>
+            </w:r>
+            <w:r>
+              <w:t xml:space="preserve"> ko</w:t>
+            </w:r>
+          </w:p>
+        </w:tc>
+        <w:tc>
+          <w:tcPr>
+            <w:tcW w:w="1558" w:type="dxa"/>
+          </w:tcPr>
+          <w:p>
+            <w:r>
+              <w:t xml:space="preserve">3 </w:t>
+            </w:r>
+            <w:r>
+              <w:t>ko</w:t>
+            </w:r>
+          </w:p>
+        </w:tc>
+        <w:tc>
+          <w:tcPr>
+            <w:tcW w:w="1559" w:type="dxa"/>
+          </w:tcPr>
+          <w:p>
+            <w:r>
+              <w:t>3</w:t>
+            </w:r>
+            <w:r>
+              <w:t xml:space="preserve"> ko</w:t>
+            </w:r>
+          </w:p>
+        </w:tc>
+      </w:tr>
+      <w:tr>
+        <w:trPr>
+          <w:trHeight w:val="586"/>
+        </w:trPr>
+        <w:tc>
+          <w:tcPr>
+            <w:tcW w:w="1705" w:type="dxa"/>
+          </w:tcPr>
+          <w:p>
+            <w:pPr>
+              <w:rPr>
+                <w:b/>
+                <w:bCs/>
+              </w:rPr>
+            </w:pPr>
+            <w:r>
+              <w:rPr>
+                <w:b/>
+                <w:bCs/>
+              </w:rPr>
+              <w:t>Nombre de requêtes http</w:t>
+            </w:r>
+          </w:p>
+        </w:tc>
+        <w:tc>
+          <w:tcPr>
+            <w:tcW w:w="1559" w:type="dxa"/>
+          </w:tcPr>
+          <w:p>
+            <w:r>
+              <w:t>3</w:t>
+            </w:r>
+          </w:p>
+        </w:tc>
+        <w:tc>
+          <w:tcPr>
+            <w:tcW w:w="1558" w:type="dxa"/>
+          </w:tcPr>
+          <w:p>
+            <w:r>
+              <w:t>3</w:t>
+            </w:r>
+          </w:p>
+        </w:tc>
+        <w:tc>
+          <w:tcPr>
+            <w:tcW w:w="1559" w:type="dxa"/>
+          </w:tcPr>
+          <w:p>
+            <w:r>
+              <w:t>7</w:t>
+            </w:r>
+          </w:p>
+        </w:tc>
+        <w:tc>
+          <w:tcPr>
+            <w:tcW w:w="1558" w:type="dxa"/>
+          </w:tcPr>
+          <w:p>
+            <w:r>
+              <w:t>8</w:t>
+            </w:r>
+          </w:p>
+        </w:tc>
+        <w:tc>
+          <w:tcPr>
+            <w:tcW w:w="1559" w:type="dxa"/>
+          </w:tcPr>
+          <w:p>
+            <w:r>
+              <w:t>7</w:t>
+            </w:r>
+          </w:p>
+        </w:tc>
+      </w:tr>
+      <w:tr>
+        <w:trPr>
+          <w:trHeight w:val="586"/>
+        </w:trPr>
+        <w:tc>
+          <w:tcPr>
+            <w:tcW w:w="1705" w:type="dxa"/>
+          </w:tcPr>
+          <w:p>
+            <w:pPr>
+              <w:rPr>
+                <w:b/>
+                <w:bCs/>
+              </w:rPr>
+            </w:pPr>
+            <w:r>
+              <w:rPr>
+                <w:b/>
+                <w:bCs/>
+              </w:rPr>
+              <w:t>Score EcoIndex</w:t>
+            </w:r>
+          </w:p>
+        </w:tc>
+        <w:tc>
+          <w:tcPr>
+            <w:tcW w:w="1559" w:type="dxa"/>
+          </w:tcPr>
+          <w:p>
+            <w:r>
+              <w:t>A (</w:t>
+            </w:r>
+            <w:r>
+              <w:t>96.59</w:t>
+            </w:r>
+            <w:r>
+              <w:t>)</w:t>
+            </w:r>
+          </w:p>
+        </w:tc>
+        <w:tc>
+          <w:tcPr>
+            <w:tcW w:w="1558" w:type="dxa"/>
+          </w:tcPr>
+          <w:p>
+            <w:r>
+              <w:t>A (</w:t>
+            </w:r>
+            <w:r>
+              <w:t>96.5</w:t>
+            </w:r>
+            <w:r>
+              <w:t>3</w:t>
+            </w:r>
+            <w:r>
+              <w:t>)</w:t>
+            </w:r>
+          </w:p>
+        </w:tc>
+        <w:tc>
+          <w:tcPr>
+            <w:tcW w:w="1559" w:type="dxa"/>
+          </w:tcPr>
+          <w:p>
+            <w:r>
+              <w:t>A (</w:t>
+            </w:r>
+            <w:r>
+              <w:t>95.53</w:t>
+            </w:r>
+            <w:r>
+              <w:t>)</w:t>
+            </w:r>
+          </w:p>
+        </w:tc>
+        <w:tc>
+          <w:tcPr>
+            <w:tcW w:w="1558" w:type="dxa"/>
+          </w:tcPr>
+          <w:p>
+            <w:r>
+              <w:t>A (</w:t>
+            </w:r>
+            <w:r>
+              <w:t>95.29</w:t>
+            </w:r>
+            <w:r>
+              <w:t>)</w:t>
+            </w:r>
+          </w:p>
+        </w:tc>
+        <w:tc>
+          <w:tcPr>
+            <w:tcW w:w="1559" w:type="dxa"/>
+          </w:tcPr>
+          <w:p>
+            <w:r>
+              <w:t>A (</w:t>
+            </w:r>
+            <w:r>
+              <w:t>95.09</w:t>
+            </w:r>
+            <w:r>
+              <w:t>)</w:t>
+            </w:r>
+          </w:p>
+        </w:tc>
+      </w:tr>
+      <w:tr>
+        <w:trPr>
+          <w:trHeight w:val="586"/>
+        </w:trPr>
+        <w:tc>
+          <w:tcPr>
+            <w:tcW w:w="1705" w:type="dxa"/>
+          </w:tcPr>
+          <w:p>
+            <w:pPr>
+              <w:rPr>
+                <w:b/>
+                <w:bCs/>
+              </w:rPr>
+            </w:pPr>
+            <w:r>
+              <w:rPr>
+                <w:b/>
+                <w:bCs/>
+              </w:rPr>
+              <w:t>Note numérique</w:t>
+            </w:r>
+          </w:p>
+        </w:tc>
+        <w:tc>
+          <w:tcPr>
+            <w:tcW w:w="1559" w:type="dxa"/>
+          </w:tcPr>
+          <w:p/>
+        </w:tc>
+        <w:tc>
+          <w:tcPr>
+            <w:tcW w:w="1558" w:type="dxa"/>
+          </w:tcPr>
+          <w:p/>
+        </w:tc>
+        <w:tc>
+          <w:tcPr>
+            <w:tcW w:w="1559" w:type="dxa"/>
+          </w:tcPr>
+          <w:p/>
+        </w:tc>
+        <w:tc>
+          <w:tcPr>
+            <w:tcW w:w="1558" w:type="dxa"/>
+          </w:tcPr>
+          <w:p/>
+        </w:tc>
+        <w:tc>
+          <w:tcPr>
+            <w:tcW w:w="1559" w:type="dxa"/>
+          </w:tcPr>
+          <w:p/>
+        </w:tc>
+      </w:tr>
+      <w:tr>
+        <w:trPr>
+          <w:trHeight w:val="586"/>
+        </w:trPr>
+        <w:tc>
+          <w:tcPr>
+            <w:tcW w:w="1705" w:type="dxa"/>
+          </w:tcPr>
+          <w:p>
+            <w:pPr>
+              <w:rPr>
+                <w:b/>
+                <w:bCs/>
+              </w:rPr>
+            </w:pPr>
+            <w:r>
+              <w:rPr>
+                <w:b/>
+                <w:bCs/>
+              </w:rPr>
+              <w:t>Empreinte CO2</w:t>
+            </w:r>
+          </w:p>
+        </w:tc>
+        <w:tc>
+          <w:tcPr>
+            <w:tcW w:w="1559" w:type="dxa"/>
+          </w:tcPr>
+          <w:p/>
+        </w:tc>
+        <w:tc>
+          <w:tcPr>
+            <w:tcW w:w="1558" w:type="dxa"/>
+          </w:tcPr>
+          <w:p/>
+        </w:tc>
+        <w:tc>
+          <w:tcPr>
+            <w:tcW w:w="1559" w:type="dxa"/>
+          </w:tcPr>
+          <w:p/>
+        </w:tc>
+        <w:tc>
+          <w:tcPr>
+            <w:tcW w:w="1558" w:type="dxa"/>
+          </w:tcPr>
+          <w:p/>
+        </w:tc>
+        <w:tc>
+          <w:tcPr>
+            <w:tcW w:w="1559" w:type="dxa"/>
+          </w:tcPr>
+          <w:p/>
+        </w:tc>
+      </w:tr>
+      <w:tr>
+        <w:trPr>
+          <w:trHeight w:val="586"/>
+        </w:trPr>
+        <w:tc>
+          <w:tcPr>
+            <w:tcW w:w="1705" w:type="dxa"/>
+          </w:tcPr>
+          <w:p>
+            <w:pPr>
+              <w:rPr>
+                <w:b/>
+                <w:bCs/>
+              </w:rPr>
+            </w:pPr>
+            <w:r>
+              <w:rPr>
+                <w:b/>
+                <w:bCs/>
+              </w:rPr>
+              <w:t>Score Lighthouse Performance</w:t>
+            </w:r>
+          </w:p>
+        </w:tc>
+        <w:tc>
+          <w:tcPr>
+            <w:tcW w:w="1559" w:type="dxa"/>
+          </w:tcPr>
+          <w:p/>
+        </w:tc>
+        <w:tc>
+          <w:tcPr>
+            <w:tcW w:w="1558" w:type="dxa"/>
+          </w:tcPr>
+          <w:p/>
+        </w:tc>
+        <w:tc>
+          <w:tcPr>
+            <w:tcW w:w="1559" w:type="dxa"/>
+          </w:tcPr>
+          <w:p/>
+        </w:tc>
+        <w:tc>
+          <w:tcPr>
+            <w:tcW w:w="1558" w:type="dxa"/>
+          </w:tcPr>
+          <w:p/>
+        </w:tc>
+        <w:tc>
+          <w:tcPr>
+            <w:tcW w:w="1559" w:type="dxa"/>
+          </w:tcPr>
+          <w:p/>
+        </w:tc>
+      </w:tr>
+      <w:tr>
+        <w:trPr>
+          <w:trHeight w:val="586"/>
+        </w:trPr>
+        <w:tc>
+          <w:tcPr>
+            <w:tcW w:w="1705" w:type="dxa"/>
+          </w:tcPr>
+          <w:p>
+            <w:pPr>
+              <w:rPr>
+                <w:b/>
+                <w:bCs/>
+              </w:rPr>
+            </w:pPr>
+            <w:r>
+              <w:rPr>
+                <w:b/>
+                <w:bCs/>
+              </w:rPr>
+              <w:lastRenderedPageBreak/>
+              <w:t>FCP</w:t>
+            </w:r>
+          </w:p>
+        </w:tc>
+        <w:tc>
+          <w:tcPr>
+            <w:tcW w:w="1559" w:type="dxa"/>
+          </w:tcPr>
+          <w:p/>
+        </w:tc>
+        <w:tc>
+          <w:tcPr>
+            <w:tcW w:w="1558" w:type="dxa"/>
+          </w:tcPr>
+          <w:p/>
+        </w:tc>
+        <w:tc>
+          <w:tcPr>
+            <w:tcW w:w="1559" w:type="dxa"/>
+          </w:tcPr>
+          <w:p/>
+        </w:tc>
+        <w:tc>
+          <w:tcPr>
+            <w:tcW w:w="1558" w:type="dxa"/>
+          </w:tcPr>
+          <w:p/>
+        </w:tc>
+        <w:tc>
+          <w:tcPr>
+            <w:tcW w:w="1559" w:type="dxa"/>
+          </w:tcPr>
+          <w:p/>
+        </w:tc>
+      </w:tr>
+      <w:tr>
+        <w:trPr>
+          <w:trHeight w:val="586"/>
+        </w:trPr>
+        <w:tc>
+          <w:tcPr>
+            <w:tcW w:w="1705" w:type="dxa"/>
+          </w:tcPr>
+          <w:p>
+            <w:pPr>
+              <w:rPr>
+                <w:b/>
+                <w:bCs/>
+              </w:rPr>
+            </w:pPr>
+            <w:r>
+              <w:rPr>
+                <w:b/>
+                <w:bCs/>
+              </w:rPr>
+              <w:t>LCP</w:t>
+            </w:r>
+          </w:p>
+        </w:tc>
+        <w:tc>
+          <w:tcPr>
+            <w:tcW w:w="1559" w:type="dxa"/>
+          </w:tcPr>
+          <w:p/>
+        </w:tc>
+        <w:tc>
+          <w:tcPr>
+            <w:tcW w:w="1558" w:type="dxa"/>
+          </w:tcPr>
+          <w:p/>
+        </w:tc>
+        <w:tc>
+          <w:tcPr>
+            <w:tcW w:w="1559" w:type="dxa"/>
+          </w:tcPr>
+          <w:p/>
+        </w:tc>
+        <w:tc>
+          <w:tcPr>
+            <w:tcW w:w="1558" w:type="dxa"/>
+          </w:tcPr>
+          <w:p/>
+        </w:tc>
+        <w:tc>
+          <w:tcPr>
+            <w:tcW w:w="1559" w:type="dxa"/>
+          </w:tcPr>
+          <w:p/>
+        </w:tc>
+      </w:tr>
+      <w:tr>
+        <w:trPr>
+          <w:trHeight w:val="586"/>
+        </w:trPr>
+        <w:tc>
+          <w:tcPr>
+            <w:tcW w:w="1705" w:type="dxa"/>
+          </w:tcPr>
+          <w:p>
+            <w:pPr>
+              <w:rPr>
+                <w:b/>
+                <w:bCs/>
+              </w:rPr>
+            </w:pPr>
+            <w:r>
+              <w:rPr>
+                <w:b/>
+                <w:bCs/>
+              </w:rPr>
+              <w:t>TBT</w:t>
+            </w:r>
+          </w:p>
+        </w:tc>
+        <w:tc>
+          <w:tcPr>
+            <w:tcW w:w="1559" w:type="dxa"/>
+          </w:tcPr>
+          <w:p/>
+        </w:tc>
+        <w:tc>
+          <w:tcPr>
+            <w:tcW w:w="1558" w:type="dxa"/>
+          </w:tcPr>
+          <w:p/>
+        </w:tc>
+        <w:tc>
+          <w:tcPr>
+            <w:tcW w:w="1559" w:type="dxa"/>
+          </w:tcPr>
+          <w:p/>
+        </w:tc>
+        <w:tc>
+          <w:tcPr>
+            <w:tcW w:w="1558" w:type="dxa"/>
+          </w:tcPr>
+          <w:p/>
+        </w:tc>
+        <w:tc>
+          <w:tcPr>
+            <w:tcW w:w="1559" w:type="dxa"/>
+          </w:tcPr>
+          <w:p/>
+        </w:tc>
+      </w:tr>
+      <w:tr>
+        <w:trPr>
+          <w:trHeight w:val="586"/>
+        </w:trPr>
+        <w:tc>
+          <w:tcPr>
+            <w:tcW w:w="1705" w:type="dxa"/>
+          </w:tcPr>
+          <w:p>
+            <w:pPr>
+              <w:rPr>
+                <w:b/>
+                <w:bCs/>
+              </w:rPr>
+            </w:pPr>
+            <w:r>
+              <w:rPr>
+                <w:b/>
+                <w:bCs/>
+              </w:rPr>
+              <w:t>CLS</w:t>
+            </w:r>
+          </w:p>
+        </w:tc>
+        <w:tc>
+          <w:tcPr>
+            <w:tcW w:w="1559" w:type="dxa"/>
+          </w:tcPr>
+          <w:p/>
+        </w:tc>
+        <w:tc>
+          <w:tcPr>
+            <w:tcW w:w="1558" w:type="dxa"/>
+          </w:tcPr>
+          <w:p/>
+        </w:tc>
+        <w:tc>
+          <w:tcPr>
+            <w:tcW w:w="1559" w:type="dxa"/>
+          </w:tcPr>
+          <w:p/>
+        </w:tc>
+        <w:tc>
+          <w:tcPr>
+            <w:tcW w:w="1558" w:type="dxa"/>
+          </w:tcPr>
+          <w:p/>
+        </w:tc>
+        <w:tc>
+          <w:tcPr>
+            <w:tcW w:w="1559" w:type="dxa"/>
+          </w:tcPr>
+          <w:p/>
+        </w:tc>
+      </w:tr>
+    </w:tbl>
+    <w:p/>
     <w:sectPr>
       <w:pgSz w:w="11906" w:h="16838"/>
       <w:pgMar w:top="1417" w:right="1417" w:bottom="1417" w:left="1417" w:header="708" w:footer="708" w:gutter="0"/>
@@ -3831,6 +5391,42 @@
     <w:basedOn w:val="Policepardfaut"/>
     <w:rsid w:val="00BF547C"/>
   </w:style>
+  <w:style w:type="paragraph" w:styleId="TM1">
+    <w:name w:val="toc 1"/>
+    <w:basedOn w:val="Normal"/>
+    <w:next w:val="Normal"/>
+    <w:autoRedefine/>
+    <w:uiPriority w:val="39"/>
+    <w:unhideWhenUsed/>
+    <w:rsid w:val="008C4194"/>
+    <w:pPr>
+      <w:spacing w:after="100"/>
+    </w:pPr>
+  </w:style>
+  <w:style w:type="paragraph" w:styleId="TM2">
+    <w:name w:val="toc 2"/>
+    <w:basedOn w:val="Normal"/>
+    <w:next w:val="Normal"/>
+    <w:autoRedefine/>
+    <w:uiPriority w:val="39"/>
+    <w:unhideWhenUsed/>
+    <w:rsid w:val="008C4194"/>
+    <w:pPr>
+      <w:spacing w:after="100"/>
+      <w:ind w:left="240"/>
+    </w:pPr>
+  </w:style>
+  <w:style w:type="character" w:styleId="Lienhypertexte">
+    <w:name w:val="Hyperlink"/>
+    <w:basedOn w:val="Policepardfaut"/>
+    <w:uiPriority w:val="99"/>
+    <w:unhideWhenUsed/>
+    <w:rsid w:val="008C4194"/>
+    <w:rPr>
+      <w:color w:val="467886" w:themeColor="hyperlink"/>
+      <w:u w:val="single"/>
+    </w:rPr>
+  </w:style>
 </w:styles>
 </file>
 

</xml_diff>